<commit_message>
Rebuild all 18 grade 8 TIC lessons (M1, M2, M3) with enhanced content and interactive features
</commit_message>
<xml_diff>
--- a/tools/printables/output/cls8_M3_algoritmi-pentru-siruri-de-val.docx
+++ b/tools/printables/output/cls8_M3_algoritmi-pentru-siruri-de-val.docx
@@ -590,171 +590,43 @@
       </w:pPr>
       <w:r>
         <w:rPr>
-          <w:b/>
-          <w:sz w:val="20"/>
+          <w:i/>
         </w:rPr>
-        <w:t>Tablou (Array)</w:t>
+        <w:t>[Tema: Notiunea de sir de valori. Declarare si initializare]</w:t>
       </w:r>
     </w:p>
     <w:p>
       <w:pPr>
-        <w:pStyle w:val="TheoryText"/>
+        <w:pStyle w:val="AnswerLine"/>
       </w:pPr>
       <w:r>
-        <w:t xml:space="preserve">Un tablou este o colectie de variabile de acelasi tip, stocate consecutiv in memorie, accesate printr-un singur nume si un index. Gandeste-te la el ca la un sir de cutii numerotate - fiecare cutie tine o valoare! </w:t>
-      </w:r>
-      <w:r>
-        <w:rPr>
-          <w:b/>
-        </w:rPr>
-        <w:t>Important:</w:t>
-      </w:r>
-      <w:r>
-        <w:t xml:space="preserve"> In C++, tablourile sunt indexate de la 0. Asta inseamna ca primul element are indexul 0, al doilea are indexul 1, si...</w:t>
+        <w:t>_____________________________________________________________________________________</w:t>
       </w:r>
     </w:p>
     <w:p>
       <w:pPr>
-        <w:pStyle w:val="TheoryText"/>
+        <w:pStyle w:val="AnswerLine"/>
       </w:pPr>
       <w:r>
-        <w:rPr>
-          <w:b/>
-          <w:sz w:val="20"/>
-        </w:rPr>
-        <w:t>Accesarea elementelor din tablou</w:t>
+        <w:t>_____________________________________________________________________________________</w:t>
       </w:r>
     </w:p>
     <w:p>
       <w:pPr>
-        <w:pStyle w:val="TheoryText"/>
+        <w:pStyle w:val="AnswerLine"/>
       </w:pPr>
       <w:r>
-        <w:t>Pentru a accesa un element din tablou, folosim numele tabloului urmat de indexul in paranteze patrate: nume[index]. Atentie: indexarea incepe de la 0! Daca avem int x[5] = {2, 4,...</w:t>
+        <w:t>_____________________________________________________________________________________</w:t>
       </w:r>
     </w:p>
     <w:p>
       <w:pPr>
-        <w:pStyle w:val="TheoryText"/>
+        <w:pStyle w:val="AnswerLine"/>
       </w:pPr>
       <w:r>
-        <w:rPr>
-          <w:b/>
-          <w:sz w:val="20"/>
-        </w:rPr>
-        <w:t>Declararea tablourilor</w:t>
+        <w:t>_____________________________________________________________________________________</w:t>
       </w:r>
     </w:p>
-    <w:p>
-      <w:pPr>
-        <w:pStyle w:val="TheoryText"/>
-      </w:pPr>
-      <w:r>
-        <w:t>Pentru a declara un tablou in C++, folosim sintaxa: tip_date nume_tablou[dimensiune]; De exemplu: int note[10]; declara un tablou de 10 numere intregi. Putem initializa tabloul la...</w:t>
-      </w:r>
-    </w:p>
-    <w:p>
-      <w:pPr>
-        <w:pStyle w:val="TheoryText"/>
-      </w:pPr>
-      <w:r>
-        <w:rPr>
-          <w:b/>
-          <w:sz w:val="20"/>
-        </w:rPr>
-        <w:t>Limitele tabloului</w:t>
-      </w:r>
-    </w:p>
-    <w:p>
-      <w:pPr>
-        <w:pStyle w:val="TheoryText"/>
-      </w:pPr>
-      <w:r>
-        <w:t>Un tablou cu n elemente are indecsi de la 0 la n-1. Accesarea unui index in afara acestui interval (de ex. x[5] pentru un tablou de 5 elemente) poate cauza erori grave! Tabloul...</w:t>
-      </w:r>
-    </w:p>
-    <w:p>
-      <w:pPr>
-        <w:pStyle w:val="SectionHeader"/>
-        <w:shd w:fill="4A7C59" w:val="clear"/>
-      </w:pPr>
-      <w:r>
-        <w:rPr>
-          <w:color w:val="FFFFFF"/>
-        </w:rPr>
-        <w:t xml:space="preserve">  VOCABULAR</w:t>
-      </w:r>
-    </w:p>
-    <w:tbl>
-      <w:tblPr>
-        <w:tblW w:type="auto" w:w="0"/>
-        <w:jc w:val="center"/>
-        <w:tblLook w:firstColumn="1" w:firstRow="1" w:lastColumn="0" w:lastRow="0" w:noHBand="0" w:noVBand="1" w:val="04A0"/>
-      </w:tblPr>
-      <w:tblGrid>
-        <w:gridCol w:w="4819"/>
-        <w:gridCol w:w="4819"/>
-      </w:tblGrid>
-      <w:tr>
-        <w:tc>
-          <w:tcPr>
-            <w:tcW w:type="dxa" w:w="4819"/>
-            <w:shd w:fill="E8F0E8" w:val="clear"/>
-          </w:tcPr>
-          <w:p>
-            <w:r>
-              <w:rPr>
-                <w:b/>
-                <w:sz w:val="18"/>
-              </w:rPr>
-              <w:t>Termen</w:t>
-            </w:r>
-          </w:p>
-        </w:tc>
-        <w:tc>
-          <w:tcPr>
-            <w:tcW w:type="dxa" w:w="4819"/>
-            <w:shd w:fill="E8F0E8" w:val="clear"/>
-          </w:tcPr>
-          <w:p>
-            <w:r>
-              <w:rPr>
-                <w:b/>
-                <w:sz w:val="18"/>
-              </w:rPr>
-              <w:t>Definitie</w:t>
-            </w:r>
-          </w:p>
-        </w:tc>
-      </w:tr>
-      <w:tr>
-        <w:tc>
-          <w:tcPr>
-            <w:tcW w:type="dxa" w:w="4819"/>
-          </w:tcPr>
-          <w:p>
-            <w:r>
-              <w:rPr>
-                <w:sz w:val="18"/>
-              </w:rPr>
-              <w:t>Important:</w:t>
-            </w:r>
-          </w:p>
-        </w:tc>
-        <w:tc>
-          <w:tcPr>
-            <w:tcW w:type="dxa" w:w="4819"/>
-          </w:tcPr>
-          <w:p>
-            <w:r>
-              <w:rPr>
-                <w:sz w:val="18"/>
-              </w:rPr>
-            </w:r>
-          </w:p>
-        </w:tc>
-      </w:tr>
-    </w:tbl>
     <w:p>
       <w:pPr>
         <w:pStyle w:val="SectionHeader"/>
@@ -774,148 +646,121 @@
       <w:r>
         <w:rPr>
           <w:b/>
-          <w:sz w:val="20"/>
         </w:rPr>
         <w:t xml:space="preserve">E1. (Baza *) </w:t>
       </w:r>
       <w:r>
         <w:rPr>
-          <w:sz w:val="20"/>
+          <w:i/>
         </w:rPr>
-        <w:t>Care este indexul primului element dintr-un tablou in C++?</w:t>
+        <w:t>[Exercitiu despre: Notiunea de sir de valori. Declarare si initializare]</w:t>
       </w:r>
     </w:p>
     <w:p>
       <w:pPr>
-        <w:pStyle w:val="ExerciseText"/>
-        <w:ind w:left="567"/>
+        <w:pStyle w:val="AnswerLine"/>
       </w:pPr>
       <w:r>
-        <w:t>☐ A) 1</w:t>
+        <w:t>_____________________________________________________________________________________</w:t>
       </w:r>
     </w:p>
     <w:p>
       <w:pPr>
-        <w:pStyle w:val="ExerciseText"/>
-        <w:ind w:left="567"/>
+        <w:pStyle w:val="AnswerLine"/>
       </w:pPr>
       <w:r>
-        <w:t>☐ B) 0</w:t>
+        <w:t>_____________________________________________________________________________________</w:t>
       </w:r>
     </w:p>
     <w:p>
       <w:pPr>
-        <w:pStyle w:val="ExerciseText"/>
-        <w:ind w:left="567"/>
+        <w:pStyle w:val="AnswerLine"/>
       </w:pPr>
       <w:r>
-        <w:t>☐ C) -1</w:t>
+        <w:t>_____________________________________________________________________________________</w:t>
       </w:r>
     </w:p>
     <w:p>
       <w:pPr>
-        <w:spacing w:after="40"/>
-      </w:pPr>
-    </w:p>
-    <w:p>
-      <w:pPr>
         <w:pStyle w:val="ExerciseText"/>
       </w:pPr>
       <w:r>
         <w:rPr>
           <w:b/>
-          <w:sz w:val="20"/>
         </w:rPr>
         <w:t xml:space="preserve">E2. (Standard **) </w:t>
       </w:r>
       <w:r>
         <w:rPr>
-          <w:sz w:val="20"/>
+          <w:i/>
         </w:rPr>
-        <w:t>Avem: int x[5] = {2, 4, 6, 8, 10}; Ce valoare are x[3]?</w:t>
+        <w:t>[Exercitiu despre: Notiunea de sir de valori. Declarare si initializare]</w:t>
       </w:r>
     </w:p>
     <w:p>
       <w:pPr>
-        <w:pStyle w:val="ExerciseText"/>
-        <w:ind w:left="567"/>
+        <w:pStyle w:val="AnswerLine"/>
       </w:pPr>
       <w:r>
-        <w:t>☐ A) 6</w:t>
+        <w:t>_____________________________________________________________________________________</w:t>
       </w:r>
     </w:p>
     <w:p>
       <w:pPr>
-        <w:pStyle w:val="ExerciseText"/>
-        <w:ind w:left="567"/>
+        <w:pStyle w:val="AnswerLine"/>
       </w:pPr>
       <w:r>
-        <w:t>☐ B) 8</w:t>
+        <w:t>_____________________________________________________________________________________</w:t>
       </w:r>
     </w:p>
     <w:p>
       <w:pPr>
-        <w:pStyle w:val="ExerciseText"/>
-        <w:ind w:left="567"/>
+        <w:pStyle w:val="AnswerLine"/>
       </w:pPr>
       <w:r>
-        <w:t>☐ C) 10</w:t>
+        <w:t>_____________________________________________________________________________________</w:t>
       </w:r>
     </w:p>
     <w:p>
       <w:pPr>
-        <w:spacing w:after="40"/>
-      </w:pPr>
-    </w:p>
-    <w:p>
-      <w:pPr>
         <w:pStyle w:val="ExerciseText"/>
       </w:pPr>
       <w:r>
         <w:rPr>
           <w:b/>
-          <w:sz w:val="20"/>
         </w:rPr>
         <w:t xml:space="preserve">E3. (Avansat ***) </w:t>
       </w:r>
       <w:r>
         <w:rPr>
-          <w:sz w:val="20"/>
+          <w:i/>
         </w:rPr>
-        <w:t>Cum declaram un tablou de 10 numere intregi numit "note"?</w:t>
+        <w:t>[Exercitiu despre: Notiunea de sir de valori. Declarare si initializare]</w:t>
       </w:r>
     </w:p>
     <w:p>
       <w:pPr>
-        <w:pStyle w:val="ExerciseText"/>
-        <w:ind w:left="567"/>
+        <w:pStyle w:val="AnswerLine"/>
       </w:pPr>
       <w:r>
-        <w:t>☐ A) int note[10];</w:t>
+        <w:t>_____________________________________________________________________________________</w:t>
       </w:r>
     </w:p>
     <w:p>
       <w:pPr>
-        <w:pStyle w:val="ExerciseText"/>
-        <w:ind w:left="567"/>
+        <w:pStyle w:val="AnswerLine"/>
       </w:pPr>
       <w:r>
-        <w:t>☐ B) int note(10);</w:t>
+        <w:t>_____________________________________________________________________________________</w:t>
       </w:r>
     </w:p>
     <w:p>
       <w:pPr>
-        <w:pStyle w:val="ExerciseText"/>
-        <w:ind w:left="567"/>
+        <w:pStyle w:val="AnswerLine"/>
       </w:pPr>
       <w:r>
-        <w:t>☐ C) array note[10];</w:t>
+        <w:t>_____________________________________________________________________________________</w:t>
       </w:r>
-    </w:p>
-    <w:p>
-      <w:pPr>
-        <w:spacing w:after="40"/>
-      </w:pPr>
     </w:p>
     <w:p>
       <w:pPr>
@@ -1006,7 +851,7 @@
         <w:pStyle w:val="TheoryText"/>
       </w:pPr>
       <w:r>
-        <w:t>Parcurgerea unui tablou inseamna sa accesezi fiecare element, pe rand, de la primul pana la ultimul. Folosim bucla for cu o variabila care merge de la 0 la n-1 (unde n...</w:t>
+        <w:t>Parcurgerea unui tablou inseamna sa accesezi fiecare element, pe rand, de la primul pana la ultimul. Folosim bucla for cu o variabila care merge de la 0 la n-1 (unde n este numarul de elemente).</w:t>
       </w:r>
     </w:p>
     <w:p>
@@ -1026,7 +871,7 @@
         <w:pStyle w:val="TheoryText"/>
       </w:pPr>
       <w:r>
-        <w:t>Pentru a afisa toate elementele unui tablou, folosim bucla for care parcurge de la indexul 0 pana la n-1. Codul: for(int i=0; i&lt;3; i++) cout &lt;&lt; a[i] &lt;&lt; " "; afiseaza fiecare element urmat de un spatiu. Bucla se executa de 3 ori,...</w:t>
+        <w:t>Pentru a afisa toate elementele unui tablou, folosim bucla for care parcurge de la indexul 0 pana la n-1. Codul: for(int i=0; i&lt;3; i++) cout &lt;&lt; a[i] &lt;&lt; " "; afiseaza fiecare element urmat de un spatiu. Bucla se executa de 3 ori, pentru i=0, i=1 si i=2.</w:t>
       </w:r>
     </w:p>
     <w:p>
@@ -1046,7 +891,7 @@
         <w:pStyle w:val="TheoryText"/>
       </w:pPr>
       <w:r>
-        <w:t>Pentru a citi elementele unui tablou de la tastatura, parcurgem fiecare pozitie cu for si citim cu cin. Exemplu: for(int i=0; i&lt;n; i++) cin &gt;&gt; note[i]; Aceasta bucla citeste n valori de la tastatura si le...</w:t>
+        <w:t>Pentru a citi elementele unui tablou de la tastatura, parcurgem fiecare pozitie cu for si citim cu cin. Exemplu: for(int i=0; i&lt;n; i++) cin &gt;&gt; note[i]; Aceasta bucla citeste n valori de la tastatura si le stocheaza in tabloul note.</w:t>
       </w:r>
     </w:p>
     <w:p>
@@ -1066,7 +911,7 @@
         <w:pStyle w:val="TheoryText"/>
       </w:pPr>
       <w:r>
-        <w:t>Atentie la conditia din bucla for! i&lt;n inseamna ca i merge de la 0 la n-1 (n executii). i&lt;=n inseamna ca i merge de la 0 la n (n+1 executii). Pentru un tablou de n elemente, folosim i&lt;n...</w:t>
+        <w:t>Atentie la conditia din bucla for! i&lt;n inseamna ca i merge de la 0 la n-1 (n executii). i&lt;=n inseamna ca i merge de la 0 la n (n+1 executii). Pentru un tablou de n elemente, folosim i&lt;n pentru a nu depasi limitele!</w:t>
       </w:r>
     </w:p>
     <w:p>
@@ -1105,7 +950,7 @@
         <w:ind w:left="567"/>
       </w:pPr>
       <w:r>
-        <w:t>☐ A) i = 1 la i &amp;lt;= n</w:t>
+        <w:t>☐ A) i = 1 la i &lt;= n</w:t>
       </w:r>
     </w:p>
     <w:p>
@@ -1114,7 +959,7 @@
         <w:ind w:left="567"/>
       </w:pPr>
       <w:r>
-        <w:t>☐ B) i = 0 la i &amp;lt; n</w:t>
+        <w:t>☐ B) i = 0 la i &lt; n</w:t>
       </w:r>
     </w:p>
     <w:p>
@@ -1123,7 +968,7 @@
         <w:ind w:left="567"/>
       </w:pPr>
       <w:r>
-        <w:t>☐ C) i = 0 la i &amp;lt;= n</w:t>
+        <w:t>☐ C) i = 0 la i &lt;= n</w:t>
       </w:r>
     </w:p>
     <w:p>
@@ -1146,7 +991,7 @@
         <w:rPr>
           <w:sz w:val="20"/>
         </w:rPr>
-        <w:t>Care este output-ul pentru: int a[3]={5,10,15}; for(int i=0; i&amp;lt;3; i++) cout &amp;lt;&amp;lt; a[i] &amp;lt;&amp;lt; " ";</w:t>
+        <w:t>Care este output-ul pentru: int a[3]={5,10,15}; for(int i=0; i&lt;3; i++) cout &lt;&lt; a[i] &lt;&lt; " ";</w:t>
       </w:r>
     </w:p>
     <w:p>
@@ -1214,7 +1059,7 @@
         <w:ind w:left="567"/>
       </w:pPr>
       <w:r>
-        <w:t>☐ B) for(int i=0; i&amp;lt;n; i++) cin &amp;gt;&amp;gt; a[i];</w:t>
+        <w:t>☐ B) for(int i=0; i&lt;n; i++) cin &gt;&gt; a[i];</w:t>
       </w:r>
     </w:p>
     <w:p>
@@ -1223,7 +1068,7 @@
         <w:ind w:left="567"/>
       </w:pPr>
       <w:r>
-        <w:t>☐ C) cin &amp;gt;&amp;gt; a[n];</w:t>
+        <w:t>☐ C) cin &gt;&gt; a[n];</w:t>
       </w:r>
     </w:p>
     <w:p>
@@ -1320,7 +1165,9 @@
         <w:pStyle w:val="TheoryText"/>
       </w:pPr>
       <w:r>
-        <w:t xml:space="preserve">Cautarea liniara este cel mai simplu algoritm de cautare: verificam fiecare element, pe rand, pana gasim ce cautam sau pana terminam lista. Se numeste "liniara" pentru ca parcurgem elementele in linie, unul dupa altul. </w:t>
+        <w:t>Cautarea liniara este cel mai simplu algoritm de cautare: verificam fiecare element, pe rand, pana gasim ce cautam sau pana terminam lista. Se numeste "liniara" pentru ca parcurgem elementele in linie, unul dupa altul.</w:t>
+        <w:br/>
+        <w:br/>
       </w:r>
       <w:r>
         <w:rPr>
@@ -1328,8 +1175,143 @@
         </w:rPr>
         <w:t>Exemplu de cod C++:</w:t>
       </w:r>
+    </w:p>
+    <w:p>
+      <w:pPr>
+        <w:pStyle w:val="CodeBlock"/>
+        <w:ind w:left="283"/>
+        <w:shd w:fill="F0F0F0" w:val="clear"/>
+      </w:pPr>
       <w:r>
-        <w:t xml:space="preserve"> int a[5] = {3, 7, 2, 9, 5}; int cautat = 9; int pozitie = -1; // -1 inseamna "nu a fost gasit" for(int i = 0; i &lt; 5;...</w:t>
+        <w:t xml:space="preserve">  int a[5] = {3, 7, 2, 9, 5};</w:t>
+      </w:r>
+    </w:p>
+    <w:p>
+      <w:pPr>
+        <w:pStyle w:val="CodeBlock"/>
+        <w:ind w:left="283"/>
+        <w:shd w:fill="F0F0F0" w:val="clear"/>
+      </w:pPr>
+      <w:r>
+        <w:t xml:space="preserve">  int cautat = 9;</w:t>
+      </w:r>
+    </w:p>
+    <w:p>
+      <w:pPr>
+        <w:pStyle w:val="CodeBlock"/>
+        <w:ind w:left="283"/>
+        <w:shd w:fill="F0F0F0" w:val="clear"/>
+      </w:pPr>
+      <w:r>
+        <w:t xml:space="preserve">  int pozitie = -1; // -1 inseamna "nu a fost gasit"</w:t>
+      </w:r>
+    </w:p>
+    <w:p>
+      <w:pPr>
+        <w:pStyle w:val="CodeBlock"/>
+        <w:ind w:left="283"/>
+        <w:shd w:fill="F0F0F0" w:val="clear"/>
+      </w:pPr>
+      <w:r>
+        <w:t xml:space="preserve">  </w:t>
+      </w:r>
+    </w:p>
+    <w:p>
+      <w:pPr>
+        <w:pStyle w:val="CodeBlock"/>
+        <w:ind w:left="283"/>
+        <w:shd w:fill="F0F0F0" w:val="clear"/>
+      </w:pPr>
+      <w:r>
+        <w:t xml:space="preserve">  for(int i = 0; i &lt; 5; i++) {</w:t>
+      </w:r>
+    </w:p>
+    <w:p>
+      <w:pPr>
+        <w:pStyle w:val="CodeBlock"/>
+        <w:ind w:left="283"/>
+        <w:shd w:fill="F0F0F0" w:val="clear"/>
+      </w:pPr>
+      <w:r>
+        <w:t xml:space="preserve">   if(a[i] == cautat) {</w:t>
+      </w:r>
+    </w:p>
+    <w:p>
+      <w:pPr>
+        <w:pStyle w:val="CodeBlock"/>
+        <w:ind w:left="283"/>
+        <w:shd w:fill="F0F0F0" w:val="clear"/>
+      </w:pPr>
+      <w:r>
+        <w:t xml:space="preserve">   pozitie = i;</w:t>
+      </w:r>
+    </w:p>
+    <w:p>
+      <w:pPr>
+        <w:pStyle w:val="CodeBlock"/>
+        <w:ind w:left="283"/>
+        <w:shd w:fill="F0F0F0" w:val="clear"/>
+      </w:pPr>
+      <w:r>
+        <w:t xml:space="preserve">   break; // am gasit, oprim cautarea</w:t>
+      </w:r>
+    </w:p>
+    <w:p>
+      <w:pPr>
+        <w:pStyle w:val="CodeBlock"/>
+        <w:ind w:left="283"/>
+        <w:shd w:fill="F0F0F0" w:val="clear"/>
+      </w:pPr>
+      <w:r>
+        <w:t xml:space="preserve">   }</w:t>
+      </w:r>
+    </w:p>
+    <w:p>
+      <w:pPr>
+        <w:pStyle w:val="CodeBlock"/>
+        <w:ind w:left="283"/>
+        <w:shd w:fill="F0F0F0" w:val="clear"/>
+      </w:pPr>
+      <w:r>
+        <w:t xml:space="preserve">  }</w:t>
+      </w:r>
+    </w:p>
+    <w:p>
+      <w:pPr>
+        <w:pStyle w:val="CodeBlock"/>
+        <w:ind w:left="283"/>
+        <w:shd w:fill="F0F0F0" w:val="clear"/>
+      </w:pPr>
+      <w:r>
+        <w:t xml:space="preserve">  </w:t>
+      </w:r>
+    </w:p>
+    <w:p>
+      <w:pPr>
+        <w:pStyle w:val="CodeBlock"/>
+        <w:ind w:left="283"/>
+        <w:shd w:fill="F0F0F0" w:val="clear"/>
+      </w:pPr>
+      <w:r>
+        <w:t xml:space="preserve">  // pozitie va fi 3 (unde se afla 9)</w:t>
+      </w:r>
+    </w:p>
+    <w:p>
+      <w:pPr>
+        <w:pStyle w:val="CodeBlock"/>
+        <w:ind w:left="283"/>
+        <w:shd w:fill="F0F0F0" w:val="clear"/>
+      </w:pPr>
+      <w:r>
+        <w:t xml:space="preserve">  // daca nu era gasit, pozitie ramanea -1</w:t>
+      </w:r>
+    </w:p>
+    <w:p>
+      <w:pPr>
+        <w:pStyle w:val="TheoryText"/>
+      </w:pPr>
+      <w:r>
+        <w:t>Daca elementul cautat nu exista in tablou, variabila "pozitie" ramane -1 (valoarea cu care am initializat-o).</w:t>
       </w:r>
     </w:p>
     <w:p>
@@ -1349,7 +1331,7 @@
         <w:pStyle w:val="TheoryText"/>
       </w:pPr>
       <w:r>
-        <w:t>Cand cautam un element, vrem sa aflam pozitia (indexul) la care se afla. Pentru tabloul {3, 7, 2, 9, 5}: pozitia 0 are valoarea 3, pozitia 1 are...</w:t>
+        <w:t>Cand cautam un element, vrem sa aflam pozitia (indexul) la care se afla. Pentru tabloul {3, 7, 2, 9, 5}: pozitia 0 are valoarea 3, pozitia 1 are 7, pozitia 2 are 2, pozitia 3 are 9, pozitia 4 are 5. Deci valoarea 9 se afla la pozitia 3!</w:t>
       </w:r>
     </w:p>
     <w:p>
@@ -1369,7 +1351,7 @@
         <w:pStyle w:val="TheoryText"/>
       </w:pPr>
       <w:r>
-        <w:t>Daca un element apare de mai multe ori in tablou, cautarea liniara va gasi prima aparitie (cea cu cel mai mic index). De exemplu, in {5, 3,...</w:t>
+        <w:t>Daca un element apare de mai multe ori in tablou, cautarea liniara va gasi prima aparitie (cea cu cel mai mic index). De exemplu, in {5, 3, 7, 3, 9}, daca cautam 3, vom gasi pozitia 1, nu pozitia 3. Cautarea se opreste la primul element gasit!</w:t>
       </w:r>
     </w:p>
     <w:p>
@@ -1389,7 +1371,7 @@
         <w:pStyle w:val="TheoryText"/>
       </w:pPr>
       <w:r>
-        <w:t>Cautarea liniara verifica elementele unul cate unul. In cel mai bun caz, elementul e primul si facem 1 comparatie. In cel mai rau caz (elementul nu...</w:t>
+        <w:t>Cautarea liniara verifica elementele unul cate unul. In cel mai bun caz, elementul e primul si facem 1 comparatie. In cel mai rau caz (elementul nu exista sau e ultimul), facem n comparatii. Pentru tablouri mari, exista algoritmi mai rapizi (cautarea binara), dar necesita tablouri sortate.</w:t>
       </w:r>
     </w:p>
     <w:p>
@@ -1469,6 +1451,16 @@
               <w:rPr>
                 <w:sz w:val="18"/>
               </w:rPr>
+              <w:t>Exemplu de cod C++:</w:t>
+              <w:br/>
+              <w:br/>
+              <w:t>```</w:t>
+              <w:br/>
+              <w:t>int a[5] = {3, 7, 2, 9, 5};</w:t>
+              <w:br/>
+              <w:t>int cautat = 9;</w:t>
+              <w:br/>
+              <w:t>int pozi...</w:t>
             </w:r>
           </w:p>
         </w:tc>
@@ -1725,7 +1717,7 @@
         <w:pStyle w:val="TheoryText"/>
       </w:pPr>
       <w:r>
-        <w:t>Pentru a gasi maximul: Presupunem ca primul element este cel mai mare Parcurgem restul tabloului Daca gasim un element mai mare, il retinem ca noul maxim La final, avem maximul...</w:t>
+        <w:t>Pentru a gasi maximul: Presupunem ca primul element este cel mai mare Parcurgem restul tabloului Daca gasim un element mai mare, il retinem ca noul maxim La final, avem maximul real Pentru minim - la fel, dar cautam cel mai mic!</w:t>
       </w:r>
     </w:p>
     <w:p>
@@ -1745,7 +1737,7 @@
         <w:pStyle w:val="TheoryText"/>
       </w:pPr>
       <w:r>
-        <w:t>Pentru a gasi minimul, aplicam acelasi algoritm ca la maxim, dar cautam valori mai mici in loc de mai mari. In tabloul {3, 8, 2, 9, 1}: minim=3 (primul), apoi 8&gt;3 (pastram 3),...</w:t>
+        <w:t>Pentru a gasi minimul, aplicam acelasi algoritm ca la maxim, dar cautam valori mai mici in loc de mai mari. In tabloul {3, 8, 2, 9, 1}: minim=3 (primul), apoi 8&gt;3 (pastram 3), 2&lt;3 (minim=2), 9&gt;2 (pastram 2), 1&lt;2 (minim=1). Rezultat: minimul este 1.</w:t>
       </w:r>
     </w:p>
     <w:p>
@@ -1770,9 +1762,51 @@
         </w:rPr>
         <w:t>Codul pentru gasirea maximului:</w:t>
       </w:r>
+    </w:p>
+    <w:p>
+      <w:pPr>
+        <w:pStyle w:val="CodeBlock"/>
+        <w:ind w:left="283"/>
+        <w:shd w:fill="F0F0F0" w:val="clear"/>
+      </w:pPr>
       <w:r>
-        <w:t xml:space="preserve"> int maxim = a[0]; // presupunem ca primul e maximul for(int i = 1; i &lt; n; i++) // incepem de la i=1! if(a[i] &gt; maxim) maxim = a[i]; </w:t>
+        <w:t xml:space="preserve">  int maxim = a[0]; // presupunem ca primul e maximul</w:t>
       </w:r>
+    </w:p>
+    <w:p>
+      <w:pPr>
+        <w:pStyle w:val="CodeBlock"/>
+        <w:ind w:left="283"/>
+        <w:shd w:fill="F0F0F0" w:val="clear"/>
+      </w:pPr>
+      <w:r>
+        <w:t xml:space="preserve">  for(int i = 1; i &lt; n; i++) // incepem de la i=1!</w:t>
+      </w:r>
+    </w:p>
+    <w:p>
+      <w:pPr>
+        <w:pStyle w:val="CodeBlock"/>
+        <w:ind w:left="283"/>
+        <w:shd w:fill="F0F0F0" w:val="clear"/>
+      </w:pPr>
+      <w:r>
+        <w:t xml:space="preserve">   if(a[i] &gt; maxim)</w:t>
+      </w:r>
+    </w:p>
+    <w:p>
+      <w:pPr>
+        <w:pStyle w:val="CodeBlock"/>
+        <w:ind w:left="283"/>
+        <w:shd w:fill="F0F0F0" w:val="clear"/>
+      </w:pPr>
+      <w:r>
+        <w:t xml:space="preserve">   maxim = a[i];</w:t>
+      </w:r>
+    </w:p>
+    <w:p>
+      <w:pPr>
+        <w:pStyle w:val="TheoryText"/>
+      </w:pPr>
       <w:r>
         <w:rPr>
           <w:b/>
@@ -1780,7 +1814,17 @@
         <w:t>De ce incepem bucla de la i=1?</w:t>
       </w:r>
       <w:r>
-        <w:t xml:space="preserve"> Pentru ca am initializat deja maxim cu a[0] (primul element). Nu are sens sa comparam a[0] cu...</w:t>
+        <w:t xml:space="preserve"> Pentru ca am initializat deja maxim cu a[0] (primul element). Nu are sens sa comparam a[0] cu el insusi - ar fi o comparatie inutila! Asa economisim o iteratie.</w:t>
+        <w:br/>
+        <w:br/>
+        <w:t xml:space="preserve">Pentru minim, schimbam doar conditia: </w:t>
+      </w:r>
+      <w:r>
+        <w:rPr>
+          <w:rFonts w:ascii="Consolas" w:hAnsi="Consolas"/>
+          <w:sz w:val="18"/>
+        </w:rPr>
+        <w:t>if(a[i] &lt; minim)</w:t>
       </w:r>
     </w:p>
     <w:p>
@@ -1800,7 +1844,7 @@
         <w:pStyle w:val="TheoryText"/>
       </w:pPr>
       <w:r>
-        <w:t>Algoritmul functioneaza si cand toate elementele sunt egale - maximul si minimul vor fi aceeasi valoare. De asemenea, pentru un tablou cu un singur element, acel element este...</w:t>
+        <w:t>Algoritmul functioneaza si cand toate elementele sunt egale - maximul si minimul vor fi aceeasi valoare. De asemenea, pentru un tablou cu un singur element, acel element este atat maximul cat si minimul. Algoritmul nu face comparatii inutile!</w:t>
       </w:r>
     </w:p>
     <w:p>
@@ -1880,6 +1924,12 @@
               <w:rPr>
                 <w:sz w:val="18"/>
               </w:rPr>
+              <w:t>Codul pentru gasirea maximului:</w:t>
+              <w:br/>
+              <w:br/>
+              <w:t>```</w:t>
+              <w:br/>
+              <w:t>int maxim = a[0]; // presupunem ca primu...</w:t>
             </w:r>
           </w:p>
         </w:tc>
@@ -2048,7 +2098,7 @@
         <w:ind w:left="567"/>
       </w:pPr>
       <w:r>
-        <w:t>☐ A) if(a[i] &amp;lt; maxim)</w:t>
+        <w:t>☐ A) if(a[i] &lt; maxim)</w:t>
       </w:r>
     </w:p>
     <w:p>
@@ -2057,7 +2107,7 @@
         <w:ind w:left="567"/>
       </w:pPr>
       <w:r>
-        <w:t>☐ B) if(a[i] &amp;gt; maxim)</w:t>
+        <w:t>☐ B) if(a[i] &gt; maxim)</w:t>
       </w:r>
     </w:p>
     <w:p>
@@ -2163,7 +2213,7 @@
         <w:pStyle w:val="TheoryText"/>
       </w:pPr>
       <w:r>
-        <w:t>Bubble Sort este un algoritm simplu de sortare care: Compara doua elemente vecine Daca nu sunt in ordine, le interschimba Repeta pana tabloul este sortat Se numeste "bubble" (bula) pentru ca elementele mari "se ridica" spre sfarsit ca...</w:t>
+        <w:t>Bubble Sort este un algoritm simplu de sortare care: Compara doua elemente vecine Daca nu sunt in ordine, le interschimba Repeta pana tabloul este sortat Se numeste "bubble" (bula) pentru ca elementele mari "se ridica" spre sfarsit ca bulele de aer in apa!</w:t>
       </w:r>
     </w:p>
     <w:p>
@@ -2183,7 +2233,7 @@
         <w:pStyle w:val="TheoryText"/>
       </w:pPr>
       <w:r>
-        <w:t>Pentru sortare CRESCATOARE (de la mic la mare), interschimbam cand note[j] &gt; note[j+1]. Pentru sortare DESCRESCATOARE (de la mare la mic), interschimbam cand note[j] &lt; note[j+1]. Singura diferenta...</w:t>
+        <w:t>Pentru sortare CRESCATOARE (de la mic la mare), interschimbam cand note[j] &gt; note[j+1]. Pentru sortare DESCRESCATOARE (de la mare la mic), interschimbam cand note[j] &lt; note[j+1]. Singura diferenta este semnul din conditie!</w:t>
       </w:r>
     </w:p>
     <w:p>
@@ -2203,7 +2253,7 @@
         <w:pStyle w:val="TheoryText"/>
       </w:pPr>
       <w:r>
-        <w:t>Pentru a interschimba doua valori, avem nevoie de o variabila auxiliara (temp). Pasi: 1) temp = a; (salvam prima valoare) 2) a = b; (punem a doua valoare in prima) 3) b = temp; (punem valoarea salvata in a doua). Fara...</w:t>
+        <w:t>Pentru a interschimba doua valori, avem nevoie de o variabila auxiliara (temp). Pasi: 1) temp = a; (salvam prima valoare) 2) a = b; (punem a doua valoare in prima) 3) b = temp; (punem valoarea salvata in a doua). Fara temp, am pierde una din valori!</w:t>
       </w:r>
     </w:p>
     <w:p>
@@ -2223,7 +2273,7 @@
         <w:pStyle w:val="TheoryText"/>
       </w:pPr>
       <w:r>
-        <w:t>La fiecare trecere prin tablou, cel mai mare element "pluteste" spre sfarsit. Dupa prima trecere, maximul e pe ultima pozitie. Dupa a doua, al doilea maxim e pe penultima pozitie. Si tot asa! De aceea se numeste "sortare cu bule" -...</w:t>
+        <w:t>La fiecare trecere prin tablou, cel mai mare element "pluteste" spre sfarsit. Dupa prima trecere, maximul e pe ultima pozitie. Dupa a doua, al doilea maxim e pe penultima pozitie. Si tot asa! De aceea se numeste "sortare cu bule" - elementele mari se ridica ca bulele.</w:t>
       </w:r>
     </w:p>
     <w:p>
@@ -2312,7 +2362,7 @@
         <w:ind w:left="567"/>
       </w:pPr>
       <w:r>
-        <w:t>☐ A) if(note[j] &amp;gt; note[j+1])</w:t>
+        <w:t>☐ A) if(note[j] &gt; note[j+1])</w:t>
       </w:r>
     </w:p>
     <w:p>
@@ -2321,7 +2371,7 @@
         <w:ind w:left="567"/>
       </w:pPr>
       <w:r>
-        <w:t>☐ B) if(note[j] &amp;lt; note[j+1])</w:t>
+        <w:t>☐ B) if(note[j] &lt; note[j+1])</w:t>
       </w:r>
     </w:p>
     <w:p>

</xml_diff>